<commit_message>
Letterhead: show the website as www.rtlawservices.com
</commit_message>
<xml_diff>
--- a/public/brand/letterhead/RT-Law-Services-Letterhead.docx
+++ b/public/brand/letterhead/RT-Law-Services-Letterhead.docx
@@ -193,7 +193,7 @@
         <w:sz w:val="15"/>
         <w:szCs w:val="15"/>
       </w:rPr>
-      <w:t xml:space="preserve">rtlawservices.com</w:t>
+      <w:t xml:space="preserve">www.rtlawservices.com</w:t>
     </w:r>
   </w:p>
 </w:ftr>
@@ -334,7 +334,7 @@
         <w:sz w:val="15"/>
         <w:szCs w:val="15"/>
       </w:rPr>
-      <w:t xml:space="preserve">rtlawservices.com</w:t>
+      <w:t xml:space="preserve">www.rtlawservices.com</w:t>
     </w:r>
   </w:p>
 </w:ftr>
@@ -499,7 +499,7 @@
         <w:sz w:val="16"/>
         <w:szCs w:val="16"/>
       </w:rPr>
-      <w:t xml:space="preserve">rtlawservices.com</w:t>
+      <w:t xml:space="preserve">www.rtlawservices.com</w:t>
     </w:r>
   </w:p>
 </w:hdr>
@@ -743,7 +743,7 @@
         <w:sz w:val="17"/>
         <w:szCs w:val="17"/>
       </w:rPr>
-      <w:t xml:space="preserve">rtlawservices.com</w:t>
+      <w:t xml:space="preserve">www.rtlawservices.com</w:t>
     </w:r>
   </w:p>
   <w:p>

</xml_diff>

<commit_message>
Footer: animated guilloche pattern from the brand stationery; letterhead bands carry the same pattern
</commit_message>
<xml_diff>
--- a/public/brand/letterhead/RT-Law-Services-Letterhead.docx
+++ b/public/brand/letterhead/RT-Law-Services-Letterhead.docx
@@ -58,7 +58,7 @@
     </w:pPr>
     <w:r>
       <w:drawing>
-        <wp:anchor distT="0" distB="0" distL="0" distR="0" simplePos="0" allowOverlap="1" behindDoc="1" locked="1" layoutInCell="1" relativeHeight="566928">
+        <wp:anchor distT="0" distB="0" distL="0" distR="0" simplePos="0" allowOverlap="1" behindDoc="1" locked="1" layoutInCell="1" relativeHeight="1">
           <wp:simplePos x="0" y="0"/>
           <wp:positionH relativeFrom="page">
             <wp:posOffset>0</wp:posOffset>
@@ -225,7 +225,7 @@
     </w:pPr>
     <w:r>
       <w:drawing>
-        <wp:anchor distT="0" distB="0" distL="0" distR="0" simplePos="0" allowOverlap="1" behindDoc="1" locked="1" layoutInCell="1" relativeHeight="566928">
+        <wp:anchor distT="0" distB="0" distL="0" distR="0" simplePos="0" allowOverlap="1" behindDoc="1" locked="1" layoutInCell="1" relativeHeight="1">
           <wp:simplePos x="0" y="0"/>
           <wp:positionH relativeFrom="page">
             <wp:posOffset>0</wp:posOffset>

</xml_diff>